<commit_message>
Deploying to gh-pages from @ shuvom-s/shuvom-s.github.io@63b7c49f53a1bfb92043b6d0bf50304cf0573140 🚀
</commit_message>
<xml_diff>
--- a/assets/pdf/cv_jul26.docx
+++ b/assets/pdf/cv_jul26.docx
@@ -3471,13 +3471,28 @@
           <w:szCs w:val="24"/>
         </w:rPr>
       </w:pPr>
-      <w:r>
-        <w:rPr>
-          <w:rFonts w:ascii="Times New Roman" w:hAnsi="Times New Roman" w:cs="Times New Roman"/>
-          <w:b/>
-          <w:sz w:val="24"/>
-          <w:szCs w:val="24"/>
-        </w:rPr>
+    </w:p>
+    <w:p>
+      <w:pPr>
+        <w:pBdr>
+          <w:bottom w:val="single" w:sz="4" w:space="1" w:color="auto"/>
+        </w:pBdr>
+        <w:spacing w:after="60"/>
+        <w:rPr>
+          <w:rFonts w:ascii="Times New Roman" w:hAnsi="Times New Roman" w:cs="Times New Roman"/>
+          <w:b/>
+          <w:sz w:val="24"/>
+          <w:szCs w:val="24"/>
+        </w:rPr>
+      </w:pPr>
+      <w:r>
+        <w:rPr>
+          <w:rFonts w:ascii="Times New Roman" w:hAnsi="Times New Roman" w:cs="Times New Roman"/>
+          <w:b/>
+          <w:sz w:val="24"/>
+          <w:szCs w:val="24"/>
+        </w:rPr>
+        <w:lastRenderedPageBreak/>
         <w:t>LEADERSHIP &amp; OUTREACH</w:t>
       </w:r>
       <w:r>
@@ -3511,7 +3526,6 @@
           <w:sz w:val="24"/>
           <w:szCs w:val="24"/>
         </w:rPr>
-        <w:lastRenderedPageBreak/>
         <w:t>Mentor Training Chair</w:t>
       </w:r>
       <w:r>
@@ -4768,7 +4782,13 @@
       <w:rPr>
         <w:rFonts w:ascii="Times New Roman" w:hAnsi="Times New Roman" w:cs="Times New Roman"/>
       </w:rPr>
-      <w:t xml:space="preserve">April </w:t>
+      <w:t>July</w:t>
+    </w:r>
+    <w:r>
+      <w:rPr>
+        <w:rFonts w:ascii="Times New Roman" w:hAnsi="Times New Roman" w:cs="Times New Roman"/>
+      </w:rPr>
+      <w:t xml:space="preserve"> </w:t>
     </w:r>
     <w:r>
       <w:rPr>

</xml_diff>